<commit_message>
docs: régénération des 6 docx avec les dernières mises à jour
</commit_message>
<xml_diff>
--- a/livrables/docx/DIAPALER_AFRICA_Livrable6.docx
+++ b/livrables/docx/DIAPALER_AFRICA_Livrable6.docx
@@ -12520,7 +12520,7 @@
                 <w:rFonts w:ascii="Calibri" w:hAnsi="Calibri"/>
                 <w:sz w:val="20"/>
               </w:rPr>
-              <w:t>Publication Play Store</w:t>
+              <w:t>Appels vidéo (sessions mentorat)</w:t>
             </w:r>
           </w:p>
         </w:tc>
@@ -12534,7 +12534,7 @@
                 <w:rFonts w:ascii="Calibri" w:hAnsi="Calibri"/>
                 <w:sz w:val="20"/>
               </w:rPr>
-              <w:t>Google Play Console (compte développeur)</w:t>
+              <w:t>Agora.io ou WebRTC</w:t>
             </w:r>
           </w:p>
         </w:tc>
@@ -12566,7 +12566,7 @@
                 <w:rFonts w:ascii="Calibri" w:hAnsi="Calibri"/>
                 <w:sz w:val="20"/>
               </w:rPr>
-              <w:t>Appels vidéo (sessions mentorat)</w:t>
+              <w:t>Mode hors-ligne complet</w:t>
             </w:r>
           </w:p>
         </w:tc>
@@ -12581,7 +12581,7 @@
                 <w:rFonts w:ascii="Calibri" w:hAnsi="Calibri"/>
                 <w:sz w:val="20"/>
               </w:rPr>
-              <w:t>Agora.io ou WebRTC</w:t>
+              <w:t>Firebase offline persistence</w:t>
             </w:r>
           </w:p>
         </w:tc>
@@ -12611,7 +12611,7 @@
                 <w:rFonts w:ascii="Calibri" w:hAnsi="Calibri"/>
                 <w:sz w:val="20"/>
               </w:rPr>
-              <w:t>Mode hors-ligne complet</w:t>
+              <w:t>Analytiques</w:t>
             </w:r>
           </w:p>
         </w:tc>
@@ -12625,7 +12625,7 @@
                 <w:rFonts w:ascii="Calibri" w:hAnsi="Calibri"/>
                 <w:sz w:val="20"/>
               </w:rPr>
-              <w:t>Firebase offline persistence</w:t>
+              <w:t>Firebase Analytics + tableau de bord</w:t>
             </w:r>
           </w:p>
         </w:tc>
@@ -12657,7 +12657,7 @@
                 <w:rFonts w:ascii="Calibri" w:hAnsi="Calibri"/>
                 <w:sz w:val="20"/>
               </w:rPr>
-              <w:t>Analytiques</w:t>
+              <w:t>Recherche avancée</w:t>
             </w:r>
           </w:p>
         </w:tc>
@@ -12672,7 +12672,7 @@
                 <w:rFonts w:ascii="Calibri" w:hAnsi="Calibri"/>
                 <w:sz w:val="20"/>
               </w:rPr>
-              <w:t>Firebase Analytics + tableau de bord</w:t>
+              <w:t>Algolia ou Firebase Extensions</w:t>
             </w:r>
           </w:p>
         </w:tc>
@@ -12702,7 +12702,7 @@
                 <w:rFonts w:ascii="Calibri" w:hAnsi="Calibri"/>
                 <w:sz w:val="20"/>
               </w:rPr>
-              <w:t>Recherche avancée</w:t>
+              <w:t>Multi-langues</w:t>
             </w:r>
           </w:p>
         </w:tc>
@@ -12716,7 +12716,7 @@
                 <w:rFonts w:ascii="Calibri" w:hAnsi="Calibri"/>
                 <w:sz w:val="20"/>
               </w:rPr>
-              <w:t>Algolia ou Firebase Extensions</w:t>
+              <w:t>Intl package — français + wolof + anglais</w:t>
             </w:r>
           </w:p>
         </w:tc>
@@ -12748,7 +12748,7 @@
                 <w:rFonts w:ascii="Calibri" w:hAnsi="Calibri"/>
                 <w:sz w:val="20"/>
               </w:rPr>
-              <w:t>Multi-langues</w:t>
+              <w:t>Web app publique</w:t>
             </w:r>
           </w:p>
         </w:tc>
@@ -12763,98 +12763,7 @@
                 <w:rFonts w:ascii="Calibri" w:hAnsi="Calibri"/>
                 <w:sz w:val="20"/>
               </w:rPr>
-              <w:t>Intl package — français + wolof + anglais</w:t>
-            </w:r>
-          </w:p>
-        </w:tc>
-      </w:tr>
-      <w:tr>
-        <w:tc>
-          <w:tcPr>
-            <w:tcW w:type="dxa" w:w="3135"/>
-          </w:tcPr>
-          <w:p>
-            <w:r>
-              <w:rPr>
-                <w:rFonts w:ascii="Calibri" w:hAnsi="Calibri"/>
-                <w:sz w:val="20"/>
-              </w:rPr>
-              <w:t>8</w:t>
-            </w:r>
-          </w:p>
-        </w:tc>
-        <w:tc>
-          <w:tcPr>
-            <w:tcW w:type="dxa" w:w="3135"/>
-          </w:tcPr>
-          <w:p>
-            <w:r>
-              <w:rPr>
-                <w:rFonts w:ascii="Calibri" w:hAnsi="Calibri"/>
-                <w:sz w:val="20"/>
-              </w:rPr>
-              <w:t>Web app publique</w:t>
-            </w:r>
-          </w:p>
-        </w:tc>
-        <w:tc>
-          <w:tcPr>
-            <w:tcW w:type="dxa" w:w="3135"/>
-          </w:tcPr>
-          <w:p>
-            <w:r>
-              <w:rPr>
-                <w:rFonts w:ascii="Calibri" w:hAnsi="Calibri"/>
-                <w:sz w:val="20"/>
-              </w:rPr>
               <w:t>Flutter Web — vitrine et landing page</w:t>
-            </w:r>
-          </w:p>
-        </w:tc>
-      </w:tr>
-      <w:tr>
-        <w:tc>
-          <w:tcPr>
-            <w:tcW w:type="dxa" w:w="3135"/>
-            <w:shd w:val="clear" w:color="auto" w:fill="EFF6FF"/>
-          </w:tcPr>
-          <w:p>
-            <w:r>
-              <w:rPr>
-                <w:rFonts w:ascii="Calibri" w:hAnsi="Calibri"/>
-                <w:sz w:val="20"/>
-              </w:rPr>
-              <w:t>9</w:t>
-            </w:r>
-          </w:p>
-        </w:tc>
-        <w:tc>
-          <w:tcPr>
-            <w:tcW w:type="dxa" w:w="3135"/>
-            <w:shd w:val="clear" w:color="auto" w:fill="EFF6FF"/>
-          </w:tcPr>
-          <w:p>
-            <w:r>
-              <w:rPr>
-                <w:rFonts w:ascii="Calibri" w:hAnsi="Calibri"/>
-                <w:sz w:val="20"/>
-              </w:rPr>
-              <w:t>Appels vidéo (sessions mentorat)</w:t>
-            </w:r>
-          </w:p>
-        </w:tc>
-        <w:tc>
-          <w:tcPr>
-            <w:tcW w:type="dxa" w:w="3135"/>
-            <w:shd w:val="clear" w:color="auto" w:fill="EFF6FF"/>
-          </w:tcPr>
-          <w:p>
-            <w:r>
-              <w:rPr>
-                <w:rFonts w:ascii="Calibri" w:hAnsi="Calibri"/>
-                <w:sz w:val="20"/>
-              </w:rPr>
-              <w:t>Agora.io ou WebRTC</w:t>
             </w:r>
           </w:p>
         </w:tc>

</xml_diff>

<commit_message>
fix: correction sous-sections Wave L5 et nom widget L6
</commit_message>
<xml_diff>
--- a/livrables/docx/DIAPALER_AFRICA_Livrable6.docx
+++ b/livrables/docx/DIAPALER_AFRICA_Livrable6.docx
@@ -6640,7 +6640,7 @@
                 <w:rFonts w:ascii="Courier New" w:hAnsi="Courier New"/>
                 <w:sz w:val="17"/>
               </w:rPr>
-              <w:t xml:space="preserve">    ├── badges_diapaler.dart           ← SenegalFlagStrip, DiapalerWordmark</w:t>
+              <w:t xml:space="preserve">    ├── bande_drapeau.dart             ← SenegalFlagStrip (bandeau drapeau sénégalais)</w:t>
             </w:r>
           </w:p>
           <w:p>
@@ -6652,7 +6652,19 @@
                 <w:rFonts w:ascii="Courier New" w:hAnsi="Courier New"/>
                 <w:sz w:val="17"/>
               </w:rPr>
-              <w:t xml:space="preserve">    └── ...                            ← 8+ autres widgets réutilisables</w:t>
+              <w:t xml:space="preserve">    ├── logo_diapaler.dart             ← DiapalerLogoTile + DiapalerWordmark</w:t>
+            </w:r>
+          </w:p>
+          <w:p>
+            <w:pPr>
+              <w:spacing w:before="0" w:after="0"/>
+            </w:pPr>
+            <w:r>
+              <w:rPr>
+                <w:rFonts w:ascii="Courier New" w:hAnsi="Courier New"/>
+                <w:sz w:val="17"/>
+              </w:rPr>
+              <w:t xml:space="preserve">    └── ...                            ← 7+ autres widgets réutilisables</w:t>
             </w:r>
           </w:p>
         </w:tc>

</xml_diff>